<commit_message>
Add Dokumentasi_UI_dan_Diagram_Sistem.docx and monochrome sharp-cornered diagrams
</commit_message>
<xml_diff>
--- a/Artikel_Ilmiah_Sistem_Terdistribusi_3_Bab.docx
+++ b/Artikel_Ilmiah_Sistem_Terdistribusi_3_Bab.docx
@@ -340,7 +340,7 @@
       <w:r>
         <w:drawing>
           <wp:inline xmlns:a="http://schemas.openxmlformats.org/drawingml/2006/main" xmlns:pic="http://schemas.openxmlformats.org/drawingml/2006/picture">
-            <wp:extent cx="5212080" cy="3106189"/>
+            <wp:extent cx="5212080" cy="2854950"/>
             <wp:docPr id="1" name="Picture 1"/>
             <wp:cNvGraphicFramePr>
               <a:graphicFrameLocks noChangeAspect="1"/>
@@ -361,7 +361,7 @@
                   <pic:spPr>
                     <a:xfrm>
                       <a:off x="0" y="0"/>
-                      <a:ext cx="5212080" cy="3106189"/>
+                      <a:ext cx="5212080" cy="2854950"/>
                     </a:xfrm>
                     <a:prstGeom prst="rect"/>
                   </pic:spPr>
@@ -1193,7 +1193,7 @@
       <w:r>
         <w:drawing>
           <wp:inline xmlns:a="http://schemas.openxmlformats.org/drawingml/2006/main" xmlns:pic="http://schemas.openxmlformats.org/drawingml/2006/picture">
-            <wp:extent cx="5486400" cy="2489627"/>
+            <wp:extent cx="5486400" cy="2626403"/>
             <wp:docPr id="2" name="Picture 2"/>
             <wp:cNvGraphicFramePr>
               <a:graphicFrameLocks noChangeAspect="1"/>
@@ -1214,7 +1214,7 @@
                   <pic:spPr>
                     <a:xfrm>
                       <a:off x="0" y="0"/>
-                      <a:ext cx="5486400" cy="2489627"/>
+                      <a:ext cx="5486400" cy="2626403"/>
                     </a:xfrm>
                     <a:prstGeom prst="rect"/>
                   </pic:spPr>

</xml_diff>

<commit_message>
Add corrected 3-node UML Use Case diagrams and update 3-node workflow diagram
</commit_message>
<xml_diff>
--- a/Artikel_Ilmiah_Sistem_Terdistribusi_3_Bab.docx
+++ b/Artikel_Ilmiah_Sistem_Terdistribusi_3_Bab.docx
@@ -1193,7 +1193,7 @@
       <w:r>
         <w:drawing>
           <wp:inline xmlns:a="http://schemas.openxmlformats.org/drawingml/2006/main" xmlns:pic="http://schemas.openxmlformats.org/drawingml/2006/picture">
-            <wp:extent cx="5486400" cy="2626403"/>
+            <wp:extent cx="5486400" cy="2470974"/>
             <wp:docPr id="2" name="Picture 2"/>
             <wp:cNvGraphicFramePr>
               <a:graphicFrameLocks noChangeAspect="1"/>
@@ -1214,7 +1214,7 @@
                   <pic:spPr>
                     <a:xfrm>
                       <a:off x="0" y="0"/>
-                      <a:ext cx="5486400" cy="2626403"/>
+                      <a:ext cx="5486400" cy="2470974"/>
                     </a:xfrm>
                     <a:prstGeom prst="rect"/>
                   </pic:spPr>

</xml_diff>